<commit_message>
del supreme court: gate motion-brief on typst and docx (footnote widows: true keeps a quotation's orphan rule); latex reported, the asterisk span's BDC in vertical mode (fb-595.54.61)
Co-Authored-By: Claude Opus 5.5 <noreply@anthropic.com>
</commit_message>
<xml_diff>
--- a/courts/third-circuit/delaware/state/supreme-court/motion-brief/usage/OUTPUT-motion-brief.docx
+++ b/courts/third-circuit/delaware/state/supreme-court/motion-brief/usage/OUTPUT-motion-brief.docx
@@ -371,7 +371,7 @@
     </w:p>
     <w:p>
       <w:pPr>
-        <w:pStyle w:val="BodyTextNote"/>
+        <w:pStyle w:val="BodyText"/>
       </w:pPr>
       <w:r>
         <w:t xml:space="preserve">1. On November 25, 2020, police arrested Burroughs and charged him with Possession of a Firearm During the Commission of a Felony, Possession of a Firearm By a Person Prohibited, Possession of Ammunition By a Person Prohibited, Carrying a Concealed Deadly Weapon, two counts of Possession of a Controlled Substance with intent to Deliver, and Possession of Marijuana, after discovering Burroughs was carrying a loaded semi-automatic handgun, and possessed 58 bags of heroin, one bag of crack cocaine and 3 grams of marijuana.</w:t>
@@ -421,7 +421,7 @@
     </w:p>
     <w:p>
       <w:pPr>
-        <w:pStyle w:val="BodyTextNote"/>
+        <w:pStyle w:val="BodyText"/>
       </w:pPr>
       <w:r>
         <w:t xml:space="preserve">2. At a Superior Court bail hearing in January of 2021, Burroughs’ argued that his age, educational background, performance on probation, self-employment, and his prior attendance at court proceedings warranted removal of the financial conditions of his bail.</w:t>
@@ -489,7 +489,7 @@
     </w:p>
     <w:p>
       <w:pPr>
-        <w:pStyle w:val="BodyTextNote"/>
+        <w:pStyle w:val="BodyText"/>
       </w:pPr>
       <w:r>
         <w:t xml:space="preserve">3. “A writ of prohibition is the legal equivalent of the equitable remedy of an injunction. Its purpose is to keep a trial court within the limits of its own jurisdiction.”</w:t>
@@ -539,7 +539,7 @@
     </w:p>
     <w:p>
       <w:pPr>
-        <w:pStyle w:val="BodyTextNote"/>
+        <w:pStyle w:val="BodyText"/>
       </w:pPr>
       <w:r>
         <w:t xml:space="preserve">4. Relying on</w:t>
@@ -664,7 +664,7 @@
     </w:p>
     <w:p>
       <w:pPr>
-        <w:pStyle w:val="BodyTextNote"/>
+        <w:pStyle w:val="BodyText"/>
       </w:pPr>
       <w:r>
         <w:t xml:space="preserve">5. Burroughs has likewise failed to demonstrate that the Superior Court was without jurisdiction or exceeded its jurisdiction when it denied his bail modification motion. Burroughs’ petition offers no credible basis upon which to question the Superior Court’s jurisdiction.</w:t>
@@ -692,7 +692,7 @@
     </w:p>
     <w:p>
       <w:pPr>
-        <w:pStyle w:val="BodyTextNote"/>
+        <w:pStyle w:val="BodyText"/>
       </w:pPr>
       <w:r>
         <w:t xml:space="preserve">Burroughs claims the court’s order violated his right to equal protection. Thus, the court should have reviewed his claim under the strict scrutiny standard, rather than the rational basis review it applied. Burroughs is wrong. Strict scrutiny applies to claims involving constitutionally protected classes.</w:t>
@@ -738,7 +738,7 @@
     </w:p>
     <w:p>
       <w:pPr>
-        <w:pStyle w:val="BodyTextNote"/>
+        <w:pStyle w:val="BodyText"/>
       </w:pPr>
       <w:r>
         <w:t xml:space="preserve">“The government’s interest in preventing crime by arrestees is both legitimate and compelling.”</w:t>
@@ -766,7 +766,7 @@
     </w:p>
     <w:p>
       <w:pPr>
-        <w:pStyle w:val="BodyTextNote"/>
+        <w:pStyle w:val="BodyText"/>
       </w:pPr>
       <w:r>
         <w:t xml:space="preserve">In his petition Burroughs claims the Superior Court’s order violated his substantive due process rights “by failing to require or find clear and convincing evidence that [his] money bail-based incarceration is necessary and the least restrictive means of achieving the government’s purpose.”</w:t>
@@ -856,7 +856,7 @@
     </w:p>
     <w:p>
       <w:pPr>
-        <w:pStyle w:val="BodyTextNote"/>
+        <w:pStyle w:val="BodyText"/>
       </w:pPr>
       <w:r>
         <w:t xml:space="preserve">The Superior Court applied strict scrutiny review to Burroughs’ substantive due process claim and correctly evaluated the evidence under the clear and convincing standard before it determined that no other means exist that would be less strictive and still achieve a compelling government interest. Indeed, the court held a hearing and considered this very issue when Burroughs presented his expert on the subject.</w:t>
@@ -884,7 +884,7 @@
     </w:p>
     <w:p>
       <w:pPr>
-        <w:pStyle w:val="BodyTextNote"/>
+        <w:pStyle w:val="BodyText"/>
       </w:pPr>
       <w:r>
         <w:t xml:space="preserve">Burroughs also claims that the Superior Court violated his procedural due process rights by failing to apply the clear and convincing standard to his claim. He acknowledges that the order “purports to apply a clear and convincing standard,” but nonetheless contends, “it did not actually do so.”</w:t>
@@ -916,7 +916,7 @@
     </w:p>
     <w:p>
       <w:pPr>
-        <w:pStyle w:val="BodyTextNote"/>
+        <w:pStyle w:val="BodyText"/>
       </w:pPr>
       <w:r>
         <w:t xml:space="preserve">9. Burroughs additionally claims that the Superior Court’s order violates the Sufficient Sureties clause. With no legal support, he contends, “when money bail is used, it must be set to an amount calculated to promote pretrial success through financial incentivization,” although he concedes that the Sufficient Sureties clause can be satisfied even when the amount of bail “happens to be an unaffordable amount.”</w:t>

</xml_diff>